<commit_message>
Add author name to report
Co-Authored-By: Claude Opus 5.5 (1M context) <noreply@anthropic.com>
</commit_message>
<xml_diff>
--- a/report/Отчет_ЛР1.docx
+++ b/report/Отчет_ЛР1.docx
@@ -48,10 +48,10 @@
         <w:rPr>
           <w:b/>
         </w:rPr>
-        <w:t>Выполнил(а):</w:t>
+        <w:t>Выполнила:</w:t>
       </w:r>
       <w:r>
-        <w:t xml:space="preserve"> ____________________ (группа ________)</w:t>
+        <w:t xml:space="preserve"> Таарачева Екатерина Вадимовна</w:t>
       </w:r>
     </w:p>
     <w:p>
@@ -9574,13 +9574,17 @@
     </w:p>
     <w:p>
       <w:r>
-        <w:t xml:space="preserve">Код, данные разметки, сырые ответы моделей и метрики: </w:t>
+        <w:t xml:space="preserve">Код, данные разметки, сырые ответы моделей и метрики находятся в git-репозитории </w:t>
       </w:r>
       <w:r>
         <w:rPr>
-          <w:b/>
+          <w:rFonts w:ascii="Courier New" w:hAnsi="Courier New"/>
+          <w:sz w:val="20"/>
         </w:rPr>
-        <w:t>https://github.com/USERNAME/lab1_vocal_llm</w:t>
+        <w:t>lab1_vocal_llm</w:t>
+      </w:r>
+      <w:r>
+        <w:t xml:space="preserve"> (ссылка на GitHub — после публикации).</w:t>
       </w:r>
     </w:p>
     <w:p>

</xml_diff>